<commit_message>
Add Codex install tracker, first-week plan, Cards Guy writing test, and next-phase plan
Install-and-test system for safely starting to use the 257-plugin marketplace: codex-install-tracker.md + .csv (15 zero-config plugins with per-plugin test prompts + expected results), first-week-codex-plugin-plan.md (Day 1-5), cards-guy-writing-test-workflow.md (research→draft→humanize→fact-check + 3 copy-paste prompts), next-technical-phase-plan.md (Track A research MCP: Tavily/Exa/Perplexity/Firecrawl; Track B identity/video wrapping). Improved the user-guide .docx (Contents/TOC, navy headings, shaded table headers) via stdlib OOXML. README gains a Start-here section. marketplace.json unchanged.

Co-Authored-By: Claude Opus 4.8 <noreply@anthropic.com>
</commit_message>
<xml_diff>
--- a/reports/codex-marketplace-user-guide.docx
+++ b/reports/codex-marketplace-user-guide.docx
@@ -3,32 +3,180 @@
 <w:document xmlns:w="http://schemas.openxmlformats.org/wordprocessingml/2006/main">
   <w:body>
     <w:p>
-      <w:r>
-        <w:rPr>
-          <w:b/>
-          <w:sz w:val="36"/>
-          <w:szCs w:val="36"/>
+      <w:pPr>
+        <w:spacing w:before="220" w:after="80"/>
+        <w:keepNext/>
+      </w:pPr>
+      <w:r>
+        <w:rPr>
+          <w:sz w:val="40"/>
+          <w:szCs w:val="40"/>
+          <w:b/>
+          <w:color w:val="1F3864"/>
         </w:rPr>
         <w:t xml:space="preserve">Codex Marketplace — User Guide</w:t>
       </w:r>
     </w:p>
     <w:p>
+      <w:pPr>
+        <w:spacing w:before="220" w:after="80"/>
+        <w:keepNext/>
+      </w:pPr>
+      <w:r>
+        <w:rPr>
+          <w:sz w:val="28"/>
+          <w:szCs w:val="28"/>
+          <w:b/>
+          <w:color w:val="1F3864"/>
+        </w:rPr>
+        <w:t xml:space="preserve">Contents</w:t>
+      </w:r>
+    </w:p>
+    <w:p>
+      <w:pPr>
+        <w:spacing w:after="80"/>
+        <w:ind w:left="360" w:hanging="200"/>
+      </w:pPr>
+      <w:r>
+        <w:t xml:space="preserve">•  </w:t>
+      </w:r>
+      <w:r>
+        <w:rPr/>
+        <w:t xml:space="preserve">1. Executive summary</w:t>
+      </w:r>
+    </w:p>
+    <w:p>
+      <w:pPr>
+        <w:spacing w:after="80"/>
+        <w:ind w:left="360" w:hanging="200"/>
+      </w:pPr>
+      <w:r>
+        <w:t xml:space="preserve">•  </w:t>
+      </w:r>
+      <w:r>
+        <w:rPr/>
+        <w:t xml:space="preserve">2. Best plugins to install first</w:t>
+      </w:r>
+    </w:p>
+    <w:p>
+      <w:pPr>
+        <w:spacing w:after="80"/>
+        <w:ind w:left="360" w:hanging="200"/>
+      </w:pPr>
+      <w:r>
+        <w:t xml:space="preserve">•  </w:t>
+      </w:r>
+      <w:r>
+        <w:rPr/>
+        <w:t xml:space="preserve">3. Best writing stack for The Cards Guy</w:t>
+      </w:r>
+    </w:p>
+    <w:p>
+      <w:pPr>
+        <w:spacing w:after="80"/>
+        <w:ind w:left="360" w:hanging="200"/>
+      </w:pPr>
+      <w:r>
+        <w:t xml:space="preserve">•  </w:t>
+      </w:r>
+      <w:r>
+        <w:rPr/>
+        <w:t xml:space="preserve">4. Best API discovery &amp; integration stack</w:t>
+      </w:r>
+    </w:p>
+    <w:p>
+      <w:pPr>
+        <w:spacing w:after="80"/>
+        <w:ind w:left="360" w:hanging="200"/>
+      </w:pPr>
+      <w:r>
+        <w:t xml:space="preserve">•  </w:t>
+      </w:r>
+      <w:r>
+        <w:rPr/>
+        <w:t xml:space="preserve">5. Best website / app-building stacks</w:t>
+      </w:r>
+    </w:p>
+    <w:p>
+      <w:pPr>
+        <w:spacing w:after="80"/>
+        <w:ind w:left="360" w:hanging="200"/>
+      </w:pPr>
+      <w:r>
+        <w:t xml:space="preserve">•  </w:t>
+      </w:r>
+      <w:r>
+        <w:rPr/>
+        <w:t xml:space="preserve">6. Creative — image / video / identity</w:t>
+      </w:r>
+    </w:p>
+    <w:p>
+      <w:pPr>
+        <w:spacing w:after="80"/>
+        <w:ind w:left="360" w:hanging="200"/>
+      </w:pPr>
+      <w:r>
+        <w:t xml:space="preserve">•  </w:t>
+      </w:r>
+      <w:r>
+        <w:rPr/>
+        <w:t xml:space="preserve">7. Plugins that require accounts / API keys</w:t>
+      </w:r>
+    </w:p>
+    <w:p>
+      <w:pPr>
+        <w:spacing w:after="80"/>
+        <w:ind w:left="360" w:hanging="200"/>
+      </w:pPr>
+      <w:r>
+        <w:t xml:space="preserve">•  </w:t>
+      </w:r>
+      <w:r>
+        <w:rPr/>
+        <w:t xml:space="preserve">8. Do-not-install-yet list</w:t>
+      </w:r>
+    </w:p>
+    <w:p>
+      <w:pPr>
+        <w:spacing w:after="80"/>
+        <w:ind w:left="360" w:hanging="200"/>
+      </w:pPr>
+      <w:r>
+        <w:t xml:space="preserve">•  </w:t>
+      </w:r>
+      <w:r>
+        <w:rPr/>
+        <w:t xml:space="preserve">9. Full plugin dashboard</w:t>
+      </w:r>
+    </w:p>
+    <w:p>
+      <w:pPr>
+        <w:spacing w:after="80"/>
+      </w:pPr>
       <w:r>
         <w:rPr/>
         <w:t xml:space="preserve">*Your plain-English guide to yikusiel-codex-marketplace — what it is, what to install first, and how to use it for The Cards Guy, HY Credit / DisputeIQ, AI scheduling, app building, and creative work.*</w:t>
       </w:r>
     </w:p>
     <w:p>
-      <w:r>
-        <w:rPr>
-          <w:b/>
+      <w:pPr>
+        <w:spacing w:before="220" w:after="80"/>
+        <w:keepNext/>
+      </w:pPr>
+      <w:r>
+        <w:rPr>
           <w:sz w:val="30"/>
           <w:szCs w:val="30"/>
+          <w:b/>
+          <w:color w:val="1F3864"/>
         </w:rPr>
         <w:t xml:space="preserve">1. Executive summary</w:t>
       </w:r>
     </w:p>
     <w:p>
+      <w:pPr>
+        <w:spacing w:after="80"/>
+      </w:pPr>
       <w:r>
         <w:rPr>
           <w:b/>
@@ -41,6 +189,9 @@
       </w:r>
     </w:p>
     <w:p>
+      <w:pPr>
+        <w:spacing w:after="80"/>
+      </w:pPr>
       <w:r>
         <w:rPr>
           <w:b/>
@@ -63,6 +214,9 @@
       </w:r>
     </w:p>
     <w:p>
+      <w:pPr>
+        <w:spacing w:after="80"/>
+      </w:pPr>
       <w:r>
         <w:rPr>
           <w:b/>
@@ -75,6 +229,9 @@
       </w:r>
     </w:p>
     <w:p>
+      <w:pPr>
+        <w:spacing w:after="80"/>
+      </w:pPr>
       <w:r>
         <w:rPr>
           <w:b/>
@@ -97,6 +254,9 @@
       </w:r>
     </w:p>
     <w:p>
+      <w:pPr>
+        <w:spacing w:after="80"/>
+      </w:pPr>
       <w:r>
         <w:rPr>
           <w:b/>
@@ -109,9 +269,13 @@
       </w:r>
     </w:p>
     <w:p>
+      <w:pPr>
+        <w:spacing w:after="80"/>
+      </w:pPr>
       <w:r>
         <w:rPr>
           <w:i/>
+          <w:color w:val="595959"/>
           <w:b/>
         </w:rPr>
         <w:t xml:space="preserve">Golden rules:</w:t>
@@ -119,21 +283,30 @@
       <w:r>
         <w:rPr>
           <w:i/>
+          <w:color w:val="595959"/>
         </w:rPr>
         <w:t xml:space="preserve"> never rename the marketplace (yikusiel-codex-marketplace) or move .agents/plugins/marketplace.json. Adding a plugin never logs you in — you only authenticate when you choose to install + use it.</w:t>
       </w:r>
     </w:p>
     <w:p>
-      <w:r>
-        <w:rPr>
-          <w:b/>
+      <w:pPr>
+        <w:spacing w:before="220" w:after="80"/>
+        <w:keepNext/>
+      </w:pPr>
+      <w:r>
+        <w:rPr>
           <w:sz w:val="30"/>
           <w:szCs w:val="30"/>
+          <w:b/>
+          <w:color w:val="1F3864"/>
         </w:rPr>
         <w:t xml:space="preserve">2. Best plugins to install first</w:t>
       </w:r>
     </w:p>
     <w:p>
+      <w:pPr>
+        <w:spacing w:after="80"/>
+      </w:pPr>
       <w:r>
         <w:rPr/>
         <w:t xml:space="preserve">All zero-config, no account needed, broadly useful. Start here.</w:t>
@@ -143,30 +316,34 @@
       <w:tblPr>
         <w:tblW w:w="0" w:type="auto"/>
         <w:tblBorders>
-          <w:top w:val="single" w:sz="4" w:space="0" w:color="999999"/>
-          <w:left w:val="single" w:sz="4" w:space="0" w:color="999999"/>
-          <w:bottom w:val="single" w:sz="4" w:space="0" w:color="999999"/>
-          <w:right w:val="single" w:sz="4" w:space="0" w:color="999999"/>
-          <w:insideH w:val="single" w:sz="4" w:space="0" w:color="999999"/>
-          <w:insideV w:val="single" w:sz="4" w:space="0" w:color="999999"/>
+          <w:top w:val="single" w:sz="4" w:space="0" w:color="BFBFBF"/>
+          <w:left w:val="single" w:sz="4" w:space="0" w:color="BFBFBF"/>
+          <w:bottom w:val="single" w:sz="4" w:space="0" w:color="BFBFBF"/>
+          <w:right w:val="single" w:sz="4" w:space="0" w:color="BFBFBF"/>
+          <w:insideH w:val="single" w:sz="4" w:space="0" w:color="BFBFBF"/>
+          <w:insideV w:val="single" w:sz="4" w:space="0" w:color="BFBFBF"/>
         </w:tblBorders>
       </w:tblPr>
       <w:tblGrid>
-        <w:gridCol w:w="2250"/>
-        <w:gridCol w:w="2250"/>
-        <w:gridCol w:w="2250"/>
-        <w:gridCol w:w="2250"/>
+        <w:gridCol w:w="2340"/>
+        <w:gridCol w:w="2340"/>
+        <w:gridCol w:w="2340"/>
+        <w:gridCol w:w="2340"/>
       </w:tblGrid>
       <w:tr>
         <w:tc>
           <w:tcPr>
-            <w:tcW w:w="2250" w:type="dxa"/>
-            <w:shd w:val="clear" w:fill="EFEFEF"/>
-          </w:tcPr>
-          <w:p>
+            <w:tcW w:w="2340" w:type="dxa"/>
+            <w:shd w:val="clear" w:color="auto" w:fill="1F3864"/>
+          </w:tcPr>
+          <w:p>
+            <w:pPr>
+              <w:spacing w:after="20"/>
+            </w:pPr>
             <w:r>
               <w:rPr>
                 <w:b/>
+                <w:color w:val="FFFFFF"/>
               </w:rPr>
               <w:t xml:space="preserve">Plugin</w:t>
             </w:r>
@@ -174,13 +351,17 @@
         </w:tc>
         <w:tc>
           <w:tcPr>
-            <w:tcW w:w="2250" w:type="dxa"/>
-            <w:shd w:val="clear" w:fill="EFEFEF"/>
-          </w:tcPr>
-          <w:p>
+            <w:tcW w:w="2340" w:type="dxa"/>
+            <w:shd w:val="clear" w:color="auto" w:fill="1F3864"/>
+          </w:tcPr>
+          <w:p>
+            <w:pPr>
+              <w:spacing w:after="20"/>
+            </w:pPr>
             <w:r>
               <w:rPr>
                 <w:b/>
+                <w:color w:val="FFFFFF"/>
               </w:rPr>
               <w:t xml:space="preserve">What it helps with</w:t>
             </w:r>
@@ -188,13 +369,17 @@
         </w:tc>
         <w:tc>
           <w:tcPr>
-            <w:tcW w:w="2250" w:type="dxa"/>
-            <w:shd w:val="clear" w:fill="EFEFEF"/>
-          </w:tcPr>
-          <w:p>
+            <w:tcW w:w="2340" w:type="dxa"/>
+            <w:shd w:val="clear" w:color="auto" w:fill="1F3864"/>
+          </w:tcPr>
+          <w:p>
+            <w:pPr>
+              <w:spacing w:after="20"/>
+            </w:pPr>
             <w:r>
               <w:rPr>
                 <w:b/>
+                <w:color w:val="FFFFFF"/>
               </w:rPr>
               <w:t xml:space="preserve">Why first</w:t>
             </w:r>
@@ -202,13 +387,17 @@
         </w:tc>
         <w:tc>
           <w:tcPr>
-            <w:tcW w:w="2250" w:type="dxa"/>
-            <w:shd w:val="clear" w:fill="EFEFEF"/>
-          </w:tcPr>
-          <w:p>
+            <w:tcW w:w="2340" w:type="dxa"/>
+            <w:shd w:val="clear" w:color="auto" w:fill="1F3864"/>
+          </w:tcPr>
+          <w:p>
+            <w:pPr>
+              <w:spacing w:after="20"/>
+            </w:pPr>
             <w:r>
               <w:rPr>
                 <w:b/>
+                <w:color w:val="FFFFFF"/>
               </w:rPr>
               <w:t xml:space="preserve">Account/API</w:t>
             </w:r>
@@ -218,9 +407,12 @@
       <w:tr>
         <w:tc>
           <w:tcPr>
-            <w:tcW w:w="2250" w:type="dxa"/>
-          </w:tcPr>
-          <w:p>
+            <w:tcW w:w="2340" w:type="dxa"/>
+          </w:tcPr>
+          <w:p>
+            <w:pPr>
+              <w:spacing w:after="20"/>
+            </w:pPr>
             <w:r>
               <w:rPr/>
               <w:t xml:space="preserve">writers-loop</w:t>
@@ -229,9 +421,12 @@
         </w:tc>
         <w:tc>
           <w:tcPr>
-            <w:tcW w:w="2250" w:type="dxa"/>
-          </w:tcPr>
-          <w:p>
+            <w:tcW w:w="2340" w:type="dxa"/>
+          </w:tcPr>
+          <w:p>
+            <w:pPr>
+              <w:spacing w:after="20"/>
+            </w:pPr>
             <w:r>
               <w:rPr/>
               <w:t xml:space="preserve">Structured multi-stage writing (frame→draft→revise)</w:t>
@@ -240,9 +435,12 @@
         </w:tc>
         <w:tc>
           <w:tcPr>
-            <w:tcW w:w="2250" w:type="dxa"/>
-          </w:tcPr>
-          <w:p>
+            <w:tcW w:w="2340" w:type="dxa"/>
+          </w:tcPr>
+          <w:p>
+            <w:pPr>
+              <w:spacing w:after="20"/>
+            </w:pPr>
             <w:r>
               <w:rPr/>
               <w:t xml:space="preserve">Your core writing engine</w:t>
@@ -251,9 +449,12 @@
         </w:tc>
         <w:tc>
           <w:tcPr>
-            <w:tcW w:w="2250" w:type="dxa"/>
-          </w:tcPr>
-          <w:p>
+            <w:tcW w:w="2340" w:type="dxa"/>
+          </w:tcPr>
+          <w:p>
+            <w:pPr>
+              <w:spacing w:after="20"/>
+            </w:pPr>
             <w:r>
               <w:rPr/>
               <w:t xml:space="preserve">No</w:t>
@@ -264,9 +465,12 @@
       <w:tr>
         <w:tc>
           <w:tcPr>
-            <w:tcW w:w="2250" w:type="dxa"/>
-          </w:tcPr>
-          <w:p>
+            <w:tcW w:w="2340" w:type="dxa"/>
+          </w:tcPr>
+          <w:p>
+            <w:pPr>
+              <w:spacing w:after="20"/>
+            </w:pPr>
             <w:r>
               <w:rPr/>
               <w:t xml:space="preserve">unslop</w:t>
@@ -275,9 +479,12 @@
         </w:tc>
         <w:tc>
           <w:tcPr>
-            <w:tcW w:w="2250" w:type="dxa"/>
-          </w:tcPr>
-          <w:p>
+            <w:tcW w:w="2340" w:type="dxa"/>
+          </w:tcPr>
+          <w:p>
+            <w:pPr>
+              <w:spacing w:after="20"/>
+            </w:pPr>
             <w:r>
               <w:rPr/>
               <w:t xml:space="preserve">Strips "AI-sounding" wording</w:t>
@@ -286,9 +493,12 @@
         </w:tc>
         <w:tc>
           <w:tcPr>
-            <w:tcW w:w="2250" w:type="dxa"/>
-          </w:tcPr>
-          <w:p>
+            <w:tcW w:w="2340" w:type="dxa"/>
+          </w:tcPr>
+          <w:p>
+            <w:pPr>
+              <w:spacing w:after="20"/>
+            </w:pPr>
             <w:r>
               <w:rPr/>
               <w:t xml:space="preserve">Makes copy read human</w:t>
@@ -297,9 +507,12 @@
         </w:tc>
         <w:tc>
           <w:tcPr>
-            <w:tcW w:w="2250" w:type="dxa"/>
-          </w:tcPr>
-          <w:p>
+            <w:tcW w:w="2340" w:type="dxa"/>
+          </w:tcPr>
+          <w:p>
+            <w:pPr>
+              <w:spacing w:after="20"/>
+            </w:pPr>
             <w:r>
               <w:rPr/>
               <w:t xml:space="preserve">No</w:t>
@@ -310,9 +523,12 @@
       <w:tr>
         <w:tc>
           <w:tcPr>
-            <w:tcW w:w="2250" w:type="dxa"/>
-          </w:tcPr>
-          <w:p>
+            <w:tcW w:w="2340" w:type="dxa"/>
+          </w:tcPr>
+          <w:p>
+            <w:pPr>
+              <w:spacing w:after="20"/>
+            </w:pPr>
             <w:r>
               <w:rPr/>
               <w:t xml:space="preserve">claude-mem</w:t>
@@ -321,9 +537,12 @@
         </w:tc>
         <w:tc>
           <w:tcPr>
-            <w:tcW w:w="2250" w:type="dxa"/>
-          </w:tcPr>
-          <w:p>
+            <w:tcW w:w="2340" w:type="dxa"/>
+          </w:tcPr>
+          <w:p>
+            <w:pPr>
+              <w:spacing w:after="20"/>
+            </w:pPr>
             <w:r>
               <w:rPr/>
               <w:t xml:space="preserve">Persistent memory across sessions</w:t>
@@ -332,9 +551,12 @@
         </w:tc>
         <w:tc>
           <w:tcPr>
-            <w:tcW w:w="2250" w:type="dxa"/>
-          </w:tcPr>
-          <w:p>
+            <w:tcW w:w="2340" w:type="dxa"/>
+          </w:tcPr>
+          <w:p>
+            <w:pPr>
+              <w:spacing w:after="20"/>
+            </w:pPr>
             <w:r>
               <w:rPr/>
               <w:t xml:space="preserve">Keeps context/cases</w:t>
@@ -343,9 +565,12 @@
         </w:tc>
         <w:tc>
           <w:tcPr>
-            <w:tcW w:w="2250" w:type="dxa"/>
-          </w:tcPr>
-          <w:p>
+            <w:tcW w:w="2340" w:type="dxa"/>
+          </w:tcPr>
+          <w:p>
+            <w:pPr>
+              <w:spacing w:after="20"/>
+            </w:pPr>
             <w:r>
               <w:rPr/>
               <w:t xml:space="preserve">No</w:t>
@@ -356,9 +581,12 @@
       <w:tr>
         <w:tc>
           <w:tcPr>
-            <w:tcW w:w="2250" w:type="dxa"/>
-          </w:tcPr>
-          <w:p>
+            <w:tcW w:w="2340" w:type="dxa"/>
+          </w:tcPr>
+          <w:p>
+            <w:pPr>
+              <w:spacing w:after="20"/>
+            </w:pPr>
             <w:r>
               <w:rPr/>
               <w:t xml:space="preserve">pm-skills</w:t>
@@ -367,9 +595,12 @@
         </w:tc>
         <w:tc>
           <w:tcPr>
-            <w:tcW w:w="2250" w:type="dxa"/>
-          </w:tcPr>
-          <w:p>
+            <w:tcW w:w="2340" w:type="dxa"/>
+          </w:tcPr>
+          <w:p>
+            <w:pPr>
+              <w:spacing w:after="20"/>
+            </w:pPr>
             <w:r>
               <w:rPr/>
               <w:t xml:space="preserve">63 product-management skills</w:t>
@@ -378,9 +609,12 @@
         </w:tc>
         <w:tc>
           <w:tcPr>
-            <w:tcW w:w="2250" w:type="dxa"/>
-          </w:tcPr>
-          <w:p>
+            <w:tcW w:w="2340" w:type="dxa"/>
+          </w:tcPr>
+          <w:p>
+            <w:pPr>
+              <w:spacing w:after="20"/>
+            </w:pPr>
             <w:r>
               <w:rPr/>
               <w:t xml:space="preserve">Planning &amp; roadmaps</w:t>
@@ -389,9 +623,12 @@
         </w:tc>
         <w:tc>
           <w:tcPr>
-            <w:tcW w:w="2250" w:type="dxa"/>
-          </w:tcPr>
-          <w:p>
+            <w:tcW w:w="2340" w:type="dxa"/>
+          </w:tcPr>
+          <w:p>
+            <w:pPr>
+              <w:spacing w:after="20"/>
+            </w:pPr>
             <w:r>
               <w:rPr/>
               <w:t xml:space="preserve">No</w:t>
@@ -402,9 +639,12 @@
       <w:tr>
         <w:tc>
           <w:tcPr>
-            <w:tcW w:w="2250" w:type="dxa"/>
-          </w:tcPr>
-          <w:p>
+            <w:tcW w:w="2340" w:type="dxa"/>
+          </w:tcPr>
+          <w:p>
+            <w:pPr>
+              <w:spacing w:after="20"/>
+            </w:pPr>
             <w:r>
               <w:rPr/>
               <w:t xml:space="preserve">agentops</w:t>
@@ -413,9 +653,12 @@
         </w:tc>
         <w:tc>
           <w:tcPr>
-            <w:tcW w:w="2250" w:type="dxa"/>
-          </w:tcPr>
-          <w:p>
+            <w:tcW w:w="2340" w:type="dxa"/>
+          </w:tcPr>
+          <w:p>
+            <w:pPr>
+              <w:spacing w:after="20"/>
+            </w:pPr>
             <w:r>
               <w:rPr/>
               <w:t xml:space="preserve">Operational layer + 80+ workflow skills</w:t>
@@ -424,9 +667,12 @@
         </w:tc>
         <w:tc>
           <w:tcPr>
-            <w:tcW w:w="2250" w:type="dxa"/>
-          </w:tcPr>
-          <w:p>
+            <w:tcW w:w="2340" w:type="dxa"/>
+          </w:tcPr>
+          <w:p>
+            <w:pPr>
+              <w:spacing w:after="20"/>
+            </w:pPr>
             <w:r>
               <w:rPr/>
               <w:t xml:space="preserve">Better agent runs</w:t>
@@ -435,9 +681,12 @@
         </w:tc>
         <w:tc>
           <w:tcPr>
-            <w:tcW w:w="2250" w:type="dxa"/>
-          </w:tcPr>
-          <w:p>
+            <w:tcW w:w="2340" w:type="dxa"/>
+          </w:tcPr>
+          <w:p>
+            <w:pPr>
+              <w:spacing w:after="20"/>
+            </w:pPr>
             <w:r>
               <w:rPr/>
               <w:t xml:space="preserve">No</w:t>
@@ -448,9 +697,12 @@
       <w:tr>
         <w:tc>
           <w:tcPr>
-            <w:tcW w:w="2250" w:type="dxa"/>
-          </w:tcPr>
-          <w:p>
+            <w:tcW w:w="2340" w:type="dxa"/>
+          </w:tcPr>
+          <w:p>
+            <w:pPr>
+              <w:spacing w:after="20"/>
+            </w:pPr>
             <w:r>
               <w:rPr/>
               <w:t xml:space="preserve">session-orchestrator</w:t>
@@ -459,9 +711,12 @@
         </w:tc>
         <w:tc>
           <w:tcPr>
-            <w:tcW w:w="2250" w:type="dxa"/>
-          </w:tcPr>
-          <w:p>
+            <w:tcW w:w="2340" w:type="dxa"/>
+          </w:tcPr>
+          <w:p>
+            <w:pPr>
+              <w:spacing w:after="20"/>
+            </w:pPr>
             <w:r>
               <w:rPr/>
               <w:t xml:space="preserve">Plan→execute→review session flow</w:t>
@@ -470,9 +725,12 @@
         </w:tc>
         <w:tc>
           <w:tcPr>
-            <w:tcW w:w="2250" w:type="dxa"/>
-          </w:tcPr>
-          <w:p>
+            <w:tcW w:w="2340" w:type="dxa"/>
+          </w:tcPr>
+          <w:p>
+            <w:pPr>
+              <w:spacing w:after="20"/>
+            </w:pPr>
             <w:r>
               <w:rPr/>
               <w:t xml:space="preserve">Quality-gated work</w:t>
@@ -481,9 +739,12 @@
         </w:tc>
         <w:tc>
           <w:tcPr>
-            <w:tcW w:w="2250" w:type="dxa"/>
-          </w:tcPr>
-          <w:p>
+            <w:tcW w:w="2340" w:type="dxa"/>
+          </w:tcPr>
+          <w:p>
+            <w:pPr>
+              <w:spacing w:after="20"/>
+            </w:pPr>
             <w:r>
               <w:rPr/>
               <w:t xml:space="preserve">No</w:t>
@@ -494,9 +755,12 @@
       <w:tr>
         <w:tc>
           <w:tcPr>
-            <w:tcW w:w="2250" w:type="dxa"/>
-          </w:tcPr>
-          <w:p>
+            <w:tcW w:w="2340" w:type="dxa"/>
+          </w:tcPr>
+          <w:p>
+            <w:pPr>
+              <w:spacing w:after="20"/>
+            </w:pPr>
             <w:r>
               <w:rPr/>
               <w:t xml:space="preserve">microsoft-docs</w:t>
@@ -505,9 +769,12 @@
         </w:tc>
         <w:tc>
           <w:tcPr>
-            <w:tcW w:w="2250" w:type="dxa"/>
-          </w:tcPr>
-          <w:p>
+            <w:tcW w:w="2340" w:type="dxa"/>
+          </w:tcPr>
+          <w:p>
+            <w:pPr>
+              <w:spacing w:after="20"/>
+            </w:pPr>
             <w:r>
               <w:rPr/>
               <w:t xml:space="preserve">Search authoritative MS/Azure/.NET docs</w:t>
@@ -516,9 +783,12 @@
         </w:tc>
         <w:tc>
           <w:tcPr>
-            <w:tcW w:w="2250" w:type="dxa"/>
-          </w:tcPr>
-          <w:p>
+            <w:tcW w:w="2340" w:type="dxa"/>
+          </w:tcPr>
+          <w:p>
+            <w:pPr>
+              <w:spacing w:after="20"/>
+            </w:pPr>
             <w:r>
               <w:rPr/>
               <w:t xml:space="preserve">Accurate dev answers</w:t>
@@ -527,9 +797,12 @@
         </w:tc>
         <w:tc>
           <w:tcPr>
-            <w:tcW w:w="2250" w:type="dxa"/>
-          </w:tcPr>
-          <w:p>
+            <w:tcW w:w="2340" w:type="dxa"/>
+          </w:tcPr>
+          <w:p>
+            <w:pPr>
+              <w:spacing w:after="20"/>
+            </w:pPr>
             <w:r>
               <w:rPr/>
               <w:t xml:space="preserve">No</w:t>
@@ -540,9 +813,12 @@
       <w:tr>
         <w:tc>
           <w:tcPr>
-            <w:tcW w:w="2250" w:type="dxa"/>
-          </w:tcPr>
-          <w:p>
+            <w:tcW w:w="2340" w:type="dxa"/>
+          </w:tcPr>
+          <w:p>
+            <w:pPr>
+              <w:spacing w:after="20"/>
+            </w:pPr>
             <w:r>
               <w:rPr/>
               <w:t xml:space="preserve">citecheck</w:t>
@@ -551,9 +827,12 @@
         </w:tc>
         <w:tc>
           <w:tcPr>
-            <w:tcW w:w="2250" w:type="dxa"/>
-          </w:tcPr>
-          <w:p>
+            <w:tcW w:w="2340" w:type="dxa"/>
+          </w:tcPr>
+          <w:p>
+            <w:pPr>
+              <w:spacing w:after="20"/>
+            </w:pPr>
             <w:r>
               <w:rPr/>
               <w:t xml:space="preserve">Verify citations/sources exist &amp; are relevant</w:t>
@@ -562,9 +841,12 @@
         </w:tc>
         <w:tc>
           <w:tcPr>
-            <w:tcW w:w="2250" w:type="dxa"/>
-          </w:tcPr>
-          <w:p>
+            <w:tcW w:w="2340" w:type="dxa"/>
+          </w:tcPr>
+          <w:p>
+            <w:pPr>
+              <w:spacing w:after="20"/>
+            </w:pPr>
             <w:r>
               <w:rPr/>
               <w:t xml:space="preserve">Fact-checking</w:t>
@@ -573,9 +855,12 @@
         </w:tc>
         <w:tc>
           <w:tcPr>
-            <w:tcW w:w="2250" w:type="dxa"/>
-          </w:tcPr>
-          <w:p>
+            <w:tcW w:w="2340" w:type="dxa"/>
+          </w:tcPr>
+          <w:p>
+            <w:pPr>
+              <w:spacing w:after="20"/>
+            </w:pPr>
             <w:r>
               <w:rPr/>
               <w:t xml:space="preserve">No</w:t>
@@ -586,9 +871,12 @@
       <w:tr>
         <w:tc>
           <w:tcPr>
-            <w:tcW w:w="2250" w:type="dxa"/>
-          </w:tcPr>
-          <w:p>
+            <w:tcW w:w="2340" w:type="dxa"/>
+          </w:tcPr>
+          <w:p>
+            <w:pPr>
+              <w:spacing w:after="20"/>
+            </w:pPr>
             <w:r>
               <w:rPr/>
               <w:t xml:space="preserve">github-librarian</w:t>
@@ -597,9 +885,12 @@
         </w:tc>
         <w:tc>
           <w:tcPr>
-            <w:tcW w:w="2250" w:type="dxa"/>
-          </w:tcPr>
-          <w:p>
+            <w:tcW w:w="2340" w:type="dxa"/>
+          </w:tcPr>
+          <w:p>
+            <w:pPr>
+              <w:spacing w:after="20"/>
+            </w:pPr>
             <w:r>
               <w:rPr/>
               <w:t xml:space="preserve">Research repos, SDKs, code</w:t>
@@ -608,9 +899,12 @@
         </w:tc>
         <w:tc>
           <w:tcPr>
-            <w:tcW w:w="2250" w:type="dxa"/>
-          </w:tcPr>
-          <w:p>
+            <w:tcW w:w="2340" w:type="dxa"/>
+          </w:tcPr>
+          <w:p>
+            <w:pPr>
+              <w:spacing w:after="20"/>
+            </w:pPr>
             <w:r>
               <w:rPr/>
               <w:t xml:space="preserve">Find/evaluate tools</w:t>
@@ -619,9 +913,12 @@
         </w:tc>
         <w:tc>
           <w:tcPr>
-            <w:tcW w:w="2250" w:type="dxa"/>
-          </w:tcPr>
-          <w:p>
+            <w:tcW w:w="2340" w:type="dxa"/>
+          </w:tcPr>
+          <w:p>
+            <w:pPr>
+              <w:spacing w:after="20"/>
+            </w:pPr>
             <w:r>
               <w:rPr/>
               <w:t xml:space="preserve">No</w:t>
@@ -632,9 +929,12 @@
       <w:tr>
         <w:tc>
           <w:tcPr>
-            <w:tcW w:w="2250" w:type="dxa"/>
-          </w:tcPr>
-          <w:p>
+            <w:tcW w:w="2340" w:type="dxa"/>
+          </w:tcPr>
+          <w:p>
+            <w:pPr>
+              <w:spacing w:after="20"/>
+            </w:pPr>
             <w:r>
               <w:rPr/>
               <w:t xml:space="preserve">codebase-recon</w:t>
@@ -643,9 +943,12 @@
         </w:tc>
         <w:tc>
           <w:tcPr>
-            <w:tcW w:w="2250" w:type="dxa"/>
-          </w:tcPr>
-          <w:p>
+            <w:tcW w:w="2340" w:type="dxa"/>
+          </w:tcPr>
+          <w:p>
+            <w:pPr>
+              <w:spacing w:after="20"/>
+            </w:pPr>
             <w:r>
               <w:rPr/>
               <w:t xml:space="preserve">Map a repo's hotspots before editing</w:t>
@@ -654,9 +957,12 @@
         </w:tc>
         <w:tc>
           <w:tcPr>
-            <w:tcW w:w="2250" w:type="dxa"/>
-          </w:tcPr>
-          <w:p>
+            <w:tcW w:w="2340" w:type="dxa"/>
+          </w:tcPr>
+          <w:p>
+            <w:pPr>
+              <w:spacing w:after="20"/>
+            </w:pPr>
             <w:r>
               <w:rPr/>
               <w:t xml:space="preserve">Safer code changes</w:t>
@@ -665,9 +971,12 @@
         </w:tc>
         <w:tc>
           <w:tcPr>
-            <w:tcW w:w="2250" w:type="dxa"/>
-          </w:tcPr>
-          <w:p>
+            <w:tcW w:w="2340" w:type="dxa"/>
+          </w:tcPr>
+          <w:p>
+            <w:pPr>
+              <w:spacing w:after="20"/>
+            </w:pPr>
             <w:r>
               <w:rPr/>
               <w:t xml:space="preserve">No</w:t>
@@ -678,9 +987,12 @@
       <w:tr>
         <w:tc>
           <w:tcPr>
-            <w:tcW w:w="2250" w:type="dxa"/>
-          </w:tcPr>
-          <w:p>
+            <w:tcW w:w="2340" w:type="dxa"/>
+          </w:tcPr>
+          <w:p>
+            <w:pPr>
+              <w:spacing w:after="20"/>
+            </w:pPr>
             <w:r>
               <w:rPr/>
               <w:t xml:space="preserve">brooks-lint</w:t>
@@ -689,9 +1001,12 @@
         </w:tc>
         <w:tc>
           <w:tcPr>
-            <w:tcW w:w="2250" w:type="dxa"/>
-          </w:tcPr>
-          <w:p>
+            <w:tcW w:w="2340" w:type="dxa"/>
+          </w:tcPr>
+          <w:p>
+            <w:pPr>
+              <w:spacing w:after="20"/>
+            </w:pPr>
             <w:r>
               <w:rPr/>
               <w:t xml:space="preserve">Code review grounded in classic SE books</w:t>
@@ -700,9 +1015,12 @@
         </w:tc>
         <w:tc>
           <w:tcPr>
-            <w:tcW w:w="2250" w:type="dxa"/>
-          </w:tcPr>
-          <w:p>
+            <w:tcW w:w="2340" w:type="dxa"/>
+          </w:tcPr>
+          <w:p>
+            <w:pPr>
+              <w:spacing w:after="20"/>
+            </w:pPr>
             <w:r>
               <w:rPr/>
               <w:t xml:space="preserve">Higher code quality</w:t>
@@ -711,9 +1029,12 @@
         </w:tc>
         <w:tc>
           <w:tcPr>
-            <w:tcW w:w="2250" w:type="dxa"/>
-          </w:tcPr>
-          <w:p>
+            <w:tcW w:w="2340" w:type="dxa"/>
+          </w:tcPr>
+          <w:p>
+            <w:pPr>
+              <w:spacing w:after="20"/>
+            </w:pPr>
             <w:r>
               <w:rPr/>
               <w:t xml:space="preserve">No</w:t>
@@ -724,9 +1045,12 @@
       <w:tr>
         <w:tc>
           <w:tcPr>
-            <w:tcW w:w="2250" w:type="dxa"/>
-          </w:tcPr>
-          <w:p>
+            <w:tcW w:w="2340" w:type="dxa"/>
+          </w:tcPr>
+          <w:p>
+            <w:pPr>
+              <w:spacing w:after="20"/>
+            </w:pPr>
             <w:r>
               <w:rPr/>
               <w:t xml:space="preserve">commit-narrator</w:t>
@@ -735,9 +1059,12 @@
         </w:tc>
         <w:tc>
           <w:tcPr>
-            <w:tcW w:w="2250" w:type="dxa"/>
-          </w:tcPr>
-          <w:p>
+            <w:tcW w:w="2340" w:type="dxa"/>
+          </w:tcPr>
+          <w:p>
+            <w:pPr>
+              <w:spacing w:after="20"/>
+            </w:pPr>
             <w:r>
               <w:rPr/>
               <w:t xml:space="preserve">Clear commit messages from diffs</w:t>
@@ -746,9 +1073,12 @@
         </w:tc>
         <w:tc>
           <w:tcPr>
-            <w:tcW w:w="2250" w:type="dxa"/>
-          </w:tcPr>
-          <w:p>
+            <w:tcW w:w="2340" w:type="dxa"/>
+          </w:tcPr>
+          <w:p>
+            <w:pPr>
+              <w:spacing w:after="20"/>
+            </w:pPr>
             <w:r>
               <w:rPr/>
               <w:t xml:space="preserve">Cleaner git history</w:t>
@@ -757,9 +1087,12 @@
         </w:tc>
         <w:tc>
           <w:tcPr>
-            <w:tcW w:w="2250" w:type="dxa"/>
-          </w:tcPr>
-          <w:p>
+            <w:tcW w:w="2340" w:type="dxa"/>
+          </w:tcPr>
+          <w:p>
+            <w:pPr>
+              <w:spacing w:after="20"/>
+            </w:pPr>
             <w:r>
               <w:rPr/>
               <w:t xml:space="preserve">No</w:t>
@@ -770,9 +1103,12 @@
       <w:tr>
         <w:tc>
           <w:tcPr>
-            <w:tcW w:w="2250" w:type="dxa"/>
-          </w:tcPr>
-          <w:p>
+            <w:tcW w:w="2340" w:type="dxa"/>
+          </w:tcPr>
+          <w:p>
+            <w:pPr>
+              <w:spacing w:after="20"/>
+            </w:pPr>
             <w:r>
               <w:rPr/>
               <w:t xml:space="preserve">gh-project-plugin</w:t>
@@ -781,9 +1117,12 @@
         </w:tc>
         <w:tc>
           <w:tcPr>
-            <w:tcW w:w="2250" w:type="dxa"/>
-          </w:tcPr>
-          <w:p>
+            <w:tcW w:w="2340" w:type="dxa"/>
+          </w:tcPr>
+          <w:p>
+            <w:pPr>
+              <w:spacing w:after="20"/>
+            </w:pPr>
             <w:r>
               <w:rPr/>
               <w:t xml:space="preserve">GitHub project/issue management</w:t>
@@ -792,9 +1131,12 @@
         </w:tc>
         <w:tc>
           <w:tcPr>
-            <w:tcW w:w="2250" w:type="dxa"/>
-          </w:tcPr>
-          <w:p>
+            <w:tcW w:w="2340" w:type="dxa"/>
+          </w:tcPr>
+          <w:p>
+            <w:pPr>
+              <w:spacing w:after="20"/>
+            </w:pPr>
             <w:r>
               <w:rPr/>
               <w:t xml:space="preserve">Track work</w:t>
@@ -803,9 +1145,12 @@
         </w:tc>
         <w:tc>
           <w:tcPr>
-            <w:tcW w:w="2250" w:type="dxa"/>
-          </w:tcPr>
-          <w:p>
+            <w:tcW w:w="2340" w:type="dxa"/>
+          </w:tcPr>
+          <w:p>
+            <w:pPr>
+              <w:spacing w:after="20"/>
+            </w:pPr>
             <w:r>
               <w:rPr/>
               <w:t xml:space="preserve">No</w:t>
@@ -816,9 +1161,12 @@
       <w:tr>
         <w:tc>
           <w:tcPr>
-            <w:tcW w:w="2250" w:type="dxa"/>
-          </w:tcPr>
-          <w:p>
+            <w:tcW w:w="2340" w:type="dxa"/>
+          </w:tcPr>
+          <w:p>
+            <w:pPr>
+              <w:spacing w:after="20"/>
+            </w:pPr>
             <w:r>
               <w:rPr/>
               <w:t xml:space="preserve">secret-guard</w:t>
@@ -827,9 +1175,12 @@
         </w:tc>
         <w:tc>
           <w:tcPr>
-            <w:tcW w:w="2250" w:type="dxa"/>
-          </w:tcPr>
-          <w:p>
+            <w:tcW w:w="2340" w:type="dxa"/>
+          </w:tcPr>
+          <w:p>
+            <w:pPr>
+              <w:spacing w:after="20"/>
+            </w:pPr>
             <w:r>
               <w:rPr/>
               <w:t xml:space="preserve">Pre-commit secret scanner</w:t>
@@ -838,9 +1189,12 @@
         </w:tc>
         <w:tc>
           <w:tcPr>
-            <w:tcW w:w="2250" w:type="dxa"/>
-          </w:tcPr>
-          <w:p>
+            <w:tcW w:w="2340" w:type="dxa"/>
+          </w:tcPr>
+          <w:p>
+            <w:pPr>
+              <w:spacing w:after="20"/>
+            </w:pPr>
             <w:r>
               <w:rPr/>
               <w:t xml:space="preserve">Protects keys/PII</w:t>
@@ -849,9 +1203,12 @@
         </w:tc>
         <w:tc>
           <w:tcPr>
-            <w:tcW w:w="2250" w:type="dxa"/>
-          </w:tcPr>
-          <w:p>
+            <w:tcW w:w="2340" w:type="dxa"/>
+          </w:tcPr>
+          <w:p>
+            <w:pPr>
+              <w:spacing w:after="20"/>
+            </w:pPr>
             <w:r>
               <w:rPr/>
               <w:t xml:space="preserve">No</w:t>
@@ -862,9 +1219,12 @@
       <w:tr>
         <w:tc>
           <w:tcPr>
-            <w:tcW w:w="2250" w:type="dxa"/>
-          </w:tcPr>
-          <w:p>
+            <w:tcW w:w="2340" w:type="dxa"/>
+          </w:tcPr>
+          <w:p>
+            <w:pPr>
+              <w:spacing w:after="20"/>
+            </w:pPr>
             <w:r>
               <w:rPr/>
               <w:t xml:space="preserve">env-lint</w:t>
@@ -873,9 +1233,12 @@
         </w:tc>
         <w:tc>
           <w:tcPr>
-            <w:tcW w:w="2250" w:type="dxa"/>
-          </w:tcPr>
-          <w:p>
+            <w:tcW w:w="2340" w:type="dxa"/>
+          </w:tcPr>
+          <w:p>
+            <w:pPr>
+              <w:spacing w:after="20"/>
+            </w:pPr>
             <w:r>
               <w:rPr/>
               <w:t xml:space="preserve">Checks .env vs .env.example</w:t>
@@ -884,9 +1247,12 @@
         </w:tc>
         <w:tc>
           <w:tcPr>
-            <w:tcW w:w="2250" w:type="dxa"/>
-          </w:tcPr>
-          <w:p>
+            <w:tcW w:w="2340" w:type="dxa"/>
+          </w:tcPr>
+          <w:p>
+            <w:pPr>
+              <w:spacing w:after="20"/>
+            </w:pPr>
             <w:r>
               <w:rPr/>
               <w:t xml:space="preserve">Avoids config bugs</w:t>
@@ -895,9 +1261,12 @@
         </w:tc>
         <w:tc>
           <w:tcPr>
-            <w:tcW w:w="2250" w:type="dxa"/>
-          </w:tcPr>
-          <w:p>
+            <w:tcW w:w="2340" w:type="dxa"/>
+          </w:tcPr>
+          <w:p>
+            <w:pPr>
+              <w:spacing w:after="20"/>
+            </w:pPr>
             <w:r>
               <w:rPr/>
               <w:t xml:space="preserve">No</w:t>
@@ -908,9 +1277,12 @@
       <w:tr>
         <w:tc>
           <w:tcPr>
-            <w:tcW w:w="2250" w:type="dxa"/>
-          </w:tcPr>
-          <w:p>
+            <w:tcW w:w="2340" w:type="dxa"/>
+          </w:tcPr>
+          <w:p>
+            <w:pPr>
+              <w:spacing w:after="20"/>
+            </w:pPr>
             <w:r>
               <w:rPr/>
               <w:t xml:space="preserve">test-gap</w:t>
@@ -919,9 +1291,12 @@
         </w:tc>
         <w:tc>
           <w:tcPr>
-            <w:tcW w:w="2250" w:type="dxa"/>
-          </w:tcPr>
-          <w:p>
+            <w:tcW w:w="2340" w:type="dxa"/>
+          </w:tcPr>
+          <w:p>
+            <w:pPr>
+              <w:spacing w:after="20"/>
+            </w:pPr>
             <w:r>
               <w:rPr/>
               <w:t xml:space="preserve">Finds untested changed lines</w:t>
@@ -930,9 +1305,12 @@
         </w:tc>
         <w:tc>
           <w:tcPr>
-            <w:tcW w:w="2250" w:type="dxa"/>
-          </w:tcPr>
-          <w:p>
+            <w:tcW w:w="2340" w:type="dxa"/>
+          </w:tcPr>
+          <w:p>
+            <w:pPr>
+              <w:spacing w:after="20"/>
+            </w:pPr>
             <w:r>
               <w:rPr/>
               <w:t xml:space="preserve">QA before shipping</w:t>
@@ -941,9 +1319,12 @@
         </w:tc>
         <w:tc>
           <w:tcPr>
-            <w:tcW w:w="2250" w:type="dxa"/>
-          </w:tcPr>
-          <w:p>
+            <w:tcW w:w="2340" w:type="dxa"/>
+          </w:tcPr>
+          <w:p>
+            <w:pPr>
+              <w:spacing w:after="20"/>
+            </w:pPr>
             <w:r>
               <w:rPr/>
               <w:t xml:space="preserve">No</w:t>
@@ -954,9 +1335,12 @@
       <w:tr>
         <w:tc>
           <w:tcPr>
-            <w:tcW w:w="2250" w:type="dxa"/>
-          </w:tcPr>
-          <w:p>
+            <w:tcW w:w="2340" w:type="dxa"/>
+          </w:tcPr>
+          <w:p>
+            <w:pPr>
+              <w:spacing w:after="20"/>
+            </w:pPr>
             <w:r>
               <w:rPr/>
               <w:t xml:space="preserve">mermaid</w:t>
@@ -965,9 +1349,12 @@
         </w:tc>
         <w:tc>
           <w:tcPr>
-            <w:tcW w:w="2250" w:type="dxa"/>
-          </w:tcPr>
-          <w:p>
+            <w:tcW w:w="2340" w:type="dxa"/>
+          </w:tcPr>
+          <w:p>
+            <w:pPr>
+              <w:spacing w:after="20"/>
+            </w:pPr>
             <w:r>
               <w:rPr/>
               <w:t xml:space="preserve">Diagrams from text</w:t>
@@ -976,9 +1363,12 @@
         </w:tc>
         <w:tc>
           <w:tcPr>
-            <w:tcW w:w="2250" w:type="dxa"/>
-          </w:tcPr>
-          <w:p>
+            <w:tcW w:w="2340" w:type="dxa"/>
+          </w:tcPr>
+          <w:p>
+            <w:pPr>
+              <w:spacing w:after="20"/>
+            </w:pPr>
             <w:r>
               <w:rPr/>
               <w:t xml:space="preserve">Docs &amp; planning</w:t>
@@ -987,9 +1377,12 @@
         </w:tc>
         <w:tc>
           <w:tcPr>
-            <w:tcW w:w="2250" w:type="dxa"/>
-          </w:tcPr>
-          <w:p>
+            <w:tcW w:w="2340" w:type="dxa"/>
+          </w:tcPr>
+          <w:p>
+            <w:pPr>
+              <w:spacing w:after="20"/>
+            </w:pPr>
             <w:r>
               <w:rPr/>
               <w:t xml:space="preserve">No</w:t>
@@ -1000,9 +1393,12 @@
       <w:tr>
         <w:tc>
           <w:tcPr>
-            <w:tcW w:w="2250" w:type="dxa"/>
-          </w:tcPr>
-          <w:p>
+            <w:tcW w:w="2340" w:type="dxa"/>
+          </w:tcPr>
+          <w:p>
+            <w:pPr>
+              <w:spacing w:after="20"/>
+            </w:pPr>
             <w:r>
               <w:rPr/>
               <w:t xml:space="preserve">spreadsheet-peek</w:t>
@@ -1011,9 +1407,12 @@
         </w:tc>
         <w:tc>
           <w:tcPr>
-            <w:tcW w:w="2250" w:type="dxa"/>
-          </w:tcPr>
-          <w:p>
+            <w:tcW w:w="2340" w:type="dxa"/>
+          </w:tcPr>
+          <w:p>
+            <w:pPr>
+              <w:spacing w:after="20"/>
+            </w:pPr>
             <w:r>
               <w:rPr/>
               <w:t xml:space="preserve">Inspect spreadsheets/reporting</w:t>
@@ -1022,9 +1421,12 @@
         </w:tc>
         <w:tc>
           <w:tcPr>
-            <w:tcW w:w="2250" w:type="dxa"/>
-          </w:tcPr>
-          <w:p>
+            <w:tcW w:w="2340" w:type="dxa"/>
+          </w:tcPr>
+          <w:p>
+            <w:pPr>
+              <w:spacing w:after="20"/>
+            </w:pPr>
             <w:r>
               <w:rPr/>
               <w:t xml:space="preserve">Quick data checks</w:t>
@@ -1033,9 +1435,12 @@
         </w:tc>
         <w:tc>
           <w:tcPr>
-            <w:tcW w:w="2250" w:type="dxa"/>
-          </w:tcPr>
-          <w:p>
+            <w:tcW w:w="2340" w:type="dxa"/>
+          </w:tcPr>
+          <w:p>
+            <w:pPr>
+              <w:spacing w:after="20"/>
+            </w:pPr>
             <w:r>
               <w:rPr/>
               <w:t xml:space="preserve">No</w:t>
@@ -1045,16 +1450,24 @@
       </w:tr>
     </w:tbl>
     <w:p>
-      <w:r>
-        <w:rPr>
-          <w:b/>
+      <w:pPr>
+        <w:spacing w:before="220" w:after="80"/>
+        <w:keepNext/>
+      </w:pPr>
+      <w:r>
+        <w:rPr>
           <w:sz w:val="30"/>
           <w:szCs w:val="30"/>
+          <w:b/>
+          <w:color w:val="1F3864"/>
         </w:rPr>
         <w:t xml:space="preserve">3. Best writing stack for The Cards Guy</w:t>
       </w:r>
     </w:p>
     <w:p>
+      <w:pPr>
+        <w:spacing w:after="80"/>
+      </w:pPr>
       <w:r>
         <w:rPr/>
         <w:t xml:space="preserve">Goal: </w:t>
@@ -1082,7 +1495,8 @@
     </w:p>
     <w:p>
       <w:pPr>
-        <w:ind w:left="360" w:hanging="180"/>
+        <w:spacing w:after="80"/>
+        <w:ind w:left="360" w:hanging="200"/>
       </w:pPr>
       <w:r>
         <w:t xml:space="preserve">•  </w:t>
@@ -1100,7 +1514,8 @@
     </w:p>
     <w:p>
       <w:pPr>
-        <w:ind w:left="360" w:hanging="180"/>
+        <w:spacing w:after="80"/>
+        <w:ind w:left="360" w:hanging="200"/>
       </w:pPr>
       <w:r>
         <w:t xml:space="preserve">•  </w:t>
@@ -1118,7 +1533,8 @@
     </w:p>
     <w:p>
       <w:pPr>
-        <w:ind w:left="360" w:hanging="180"/>
+        <w:spacing w:after="80"/>
+        <w:ind w:left="360" w:hanging="200"/>
       </w:pPr>
       <w:r>
         <w:t xml:space="preserve">•  </w:t>
@@ -1136,7 +1552,8 @@
     </w:p>
     <w:p>
       <w:pPr>
-        <w:ind w:left="360" w:hanging="180"/>
+        <w:spacing w:after="80"/>
+        <w:ind w:left="360" w:hanging="200"/>
       </w:pPr>
       <w:r>
         <w:t xml:space="preserve">•  </w:t>
@@ -1154,7 +1571,8 @@
     </w:p>
     <w:p>
       <w:pPr>
-        <w:ind w:left="360" w:hanging="180"/>
+        <w:spacing w:after="80"/>
+        <w:ind w:left="360" w:hanging="200"/>
       </w:pPr>
       <w:r>
         <w:t xml:space="preserve">•  </w:t>
@@ -1171,6 +1589,9 @@
       </w:r>
     </w:p>
     <w:p>
+      <w:pPr>
+        <w:spacing w:after="80"/>
+      </w:pPr>
       <w:r>
         <w:rPr>
           <w:b/>
@@ -1179,6 +1600,9 @@
       </w:r>
     </w:p>
     <w:p>
+      <w:pPr>
+        <w:spacing w:after="80"/>
+      </w:pPr>
       <w:r>
         <w:rPr/>
         <w:t xml:space="preserve">1. </w:t>
@@ -1195,6 +1619,9 @@
       </w:r>
     </w:p>
     <w:p>
+      <w:pPr>
+        <w:spacing w:after="80"/>
+      </w:pPr>
       <w:r>
         <w:rPr/>
         <w:t xml:space="preserve">2. </w:t>
@@ -1221,6 +1648,9 @@
       </w:r>
     </w:p>
     <w:p>
+      <w:pPr>
+        <w:spacing w:after="80"/>
+      </w:pPr>
       <w:r>
         <w:rPr/>
         <w:t xml:space="preserve">3. </w:t>
@@ -1237,6 +1667,9 @@
       </w:r>
     </w:p>
     <w:p>
+      <w:pPr>
+        <w:spacing w:after="80"/>
+      </w:pPr>
       <w:r>
         <w:rPr/>
         <w:t xml:space="preserve">4. </w:t>
@@ -1253,6 +1686,9 @@
       </w:r>
     </w:p>
     <w:p>
+      <w:pPr>
+        <w:spacing w:after="80"/>
+      </w:pPr>
       <w:r>
         <w:rPr/>
         <w:t xml:space="preserve">5. </w:t>
@@ -1269,6 +1705,9 @@
       </w:r>
     </w:p>
     <w:p>
+      <w:pPr>
+        <w:spacing w:after="80"/>
+      </w:pPr>
       <w:r>
         <w:rPr/>
         <w:t xml:space="preserve">6. </w:t>
@@ -1285,6 +1724,9 @@
       </w:r>
     </w:p>
     <w:p>
+      <w:pPr>
+        <w:spacing w:after="80"/>
+      </w:pPr>
       <w:r>
         <w:rPr/>
         <w:t xml:space="preserve">7. </w:t>
@@ -1301,6 +1743,9 @@
       </w:r>
     </w:p>
     <w:p>
+      <w:pPr>
+        <w:spacing w:after="80"/>
+      </w:pPr>
       <w:r>
         <w:rPr>
           <w:b/>
@@ -1313,6 +1758,9 @@
       </w:r>
     </w:p>
     <w:p>
+      <w:pPr>
+        <w:spacing w:after="80"/>
+      </w:pPr>
       <w:r>
         <w:rPr>
           <w:b/>
@@ -1335,22 +1783,33 @@
       </w:r>
     </w:p>
     <w:p>
+      <w:pPr>
+        <w:spacing w:after="80"/>
+      </w:pPr>
       <w:r>
         <w:rPr/>
         <w:t xml:space="preserve">*(Full detail: reports/credit-card-writing-stack.md.)*</w:t>
       </w:r>
     </w:p>
     <w:p>
-      <w:r>
-        <w:rPr>
-          <w:b/>
+      <w:pPr>
+        <w:spacing w:before="220" w:after="80"/>
+        <w:keepNext/>
+      </w:pPr>
+      <w:r>
+        <w:rPr>
           <w:sz w:val="30"/>
           <w:szCs w:val="30"/>
+          <w:b/>
+          <w:color w:val="1F3864"/>
         </w:rPr>
         <w:t xml:space="preserve">4. Best API discovery &amp; integration stack</w:t>
       </w:r>
     </w:p>
     <w:p>
+      <w:pPr>
+        <w:spacing w:after="80"/>
+      </w:pPr>
       <w:r>
         <w:rPr/>
         <w:t xml:space="preserve">There's no single "API finder" — this is a workflow built from real plugins.</w:t>
@@ -1358,7 +1817,8 @@
     </w:p>
     <w:p>
       <w:pPr>
-        <w:ind w:left="360" w:hanging="180"/>
+        <w:spacing w:after="80"/>
+        <w:ind w:left="360" w:hanging="200"/>
       </w:pPr>
       <w:r>
         <w:t xml:space="preserve">•  </w:t>
@@ -1376,7 +1836,8 @@
     </w:p>
     <w:p>
       <w:pPr>
-        <w:ind w:left="360" w:hanging="180"/>
+        <w:spacing w:after="80"/>
+        <w:ind w:left="360" w:hanging="200"/>
       </w:pPr>
       <w:r>
         <w:t xml:space="preserve">•  </w:t>
@@ -1394,7 +1855,8 @@
     </w:p>
     <w:p>
       <w:pPr>
-        <w:ind w:left="360" w:hanging="180"/>
+        <w:spacing w:after="80"/>
+        <w:ind w:left="360" w:hanging="200"/>
       </w:pPr>
       <w:r>
         <w:t xml:space="preserve">•  </w:t>
@@ -1412,7 +1874,8 @@
     </w:p>
     <w:p>
       <w:pPr>
-        <w:ind w:left="360" w:hanging="180"/>
+        <w:spacing w:after="80"/>
+        <w:ind w:left="360" w:hanging="200"/>
       </w:pPr>
       <w:r>
         <w:t xml:space="preserve">•  </w:t>
@@ -1430,7 +1893,8 @@
     </w:p>
     <w:p>
       <w:pPr>
-        <w:ind w:left="360" w:hanging="180"/>
+        <w:spacing w:after="80"/>
+        <w:ind w:left="360" w:hanging="200"/>
       </w:pPr>
       <w:r>
         <w:t xml:space="preserve">•  </w:t>
@@ -1447,24 +1911,33 @@
       </w:r>
     </w:p>
     <w:p>
+      <w:pPr>
+        <w:spacing w:after="80"/>
+      </w:pPr>
       <w:r>
         <w:rPr/>
         <w:t xml:space="preserve">*(Full detail: reports/api-discovery-and-integration-stack.md. Not yet in marketplace — connect as MCP later: Tavily, Exa, Perplexity, Postman, Bruno.)*</w:t>
       </w:r>
     </w:p>
     <w:p>
-      <w:r>
-        <w:rPr>
-          <w:b/>
+      <w:pPr>
+        <w:spacing w:before="220" w:after="80"/>
+        <w:keepNext/>
+      </w:pPr>
+      <w:r>
+        <w:rPr>
           <w:sz w:val="30"/>
           <w:szCs w:val="30"/>
+          <w:b/>
+          <w:color w:val="1F3864"/>
         </w:rPr>
         <w:t xml:space="preserve">5. Best website / app-building stacks</w:t>
       </w:r>
     </w:p>
     <w:p>
       <w:pPr>
-        <w:ind w:left="360" w:hanging="180"/>
+        <w:spacing w:after="80"/>
+        <w:ind w:left="360" w:hanging="200"/>
       </w:pPr>
       <w:r>
         <w:t xml:space="preserve">•  </w:t>
@@ -1482,7 +1955,8 @@
     </w:p>
     <w:p>
       <w:pPr>
-        <w:ind w:left="360" w:hanging="180"/>
+        <w:spacing w:after="80"/>
+        <w:ind w:left="360" w:hanging="200"/>
       </w:pPr>
       <w:r>
         <w:t xml:space="preserve">•  </w:t>
@@ -1500,7 +1974,8 @@
     </w:p>
     <w:p>
       <w:pPr>
-        <w:ind w:left="360" w:hanging="180"/>
+        <w:spacing w:after="80"/>
+        <w:ind w:left="360" w:hanging="200"/>
       </w:pPr>
       <w:r>
         <w:t xml:space="preserve">•  </w:t>
@@ -1518,7 +1993,8 @@
     </w:p>
     <w:p>
       <w:pPr>
-        <w:ind w:left="360" w:hanging="180"/>
+        <w:spacing w:after="80"/>
+        <w:ind w:left="360" w:hanging="200"/>
       </w:pPr>
       <w:r>
         <w:t xml:space="preserve">•  </w:t>
@@ -1536,7 +2012,8 @@
     </w:p>
     <w:p>
       <w:pPr>
-        <w:ind w:left="360" w:hanging="180"/>
+        <w:spacing w:after="80"/>
+        <w:ind w:left="360" w:hanging="200"/>
       </w:pPr>
       <w:r>
         <w:t xml:space="preserve">•  </w:t>
@@ -1554,7 +2031,8 @@
     </w:p>
     <w:p>
       <w:pPr>
-        <w:ind w:left="360" w:hanging="180"/>
+        <w:spacing w:after="80"/>
+        <w:ind w:left="360" w:hanging="200"/>
       </w:pPr>
       <w:r>
         <w:t xml:space="preserve">•  </w:t>
@@ -1572,7 +2050,8 @@
     </w:p>
     <w:p>
       <w:pPr>
-        <w:ind w:left="360" w:hanging="180"/>
+        <w:spacing w:after="80"/>
+        <w:ind w:left="360" w:hanging="200"/>
       </w:pPr>
       <w:r>
         <w:t xml:space="preserve">•  </w:t>
@@ -1590,7 +2069,8 @@
     </w:p>
     <w:p>
       <w:pPr>
-        <w:ind w:left="360" w:hanging="180"/>
+        <w:spacing w:after="80"/>
+        <w:ind w:left="360" w:hanging="200"/>
       </w:pPr>
       <w:r>
         <w:t xml:space="preserve">•  </w:t>
@@ -1607,6 +2087,9 @@
       </w:r>
     </w:p>
     <w:p>
+      <w:pPr>
+        <w:spacing w:after="80"/>
+      </w:pPr>
       <w:r>
         <w:rPr>
           <w:b/>
@@ -1616,7 +2099,8 @@
     </w:p>
     <w:p>
       <w:pPr>
-        <w:ind w:left="360" w:hanging="180"/>
+        <w:spacing w:after="80"/>
+        <w:ind w:left="360" w:hanging="200"/>
       </w:pPr>
       <w:r>
         <w:t xml:space="preserve">•  </w:t>
@@ -1634,7 +2118,8 @@
     </w:p>
     <w:p>
       <w:pPr>
-        <w:ind w:left="360" w:hanging="180"/>
+        <w:spacing w:after="80"/>
+        <w:ind w:left="360" w:hanging="200"/>
       </w:pPr>
       <w:r>
         <w:t xml:space="preserve">•  </w:t>
@@ -1658,7 +2143,8 @@
     </w:p>
     <w:p>
       <w:pPr>
-        <w:ind w:left="360" w:hanging="180"/>
+        <w:spacing w:after="80"/>
+        <w:ind w:left="360" w:hanging="200"/>
       </w:pPr>
       <w:r>
         <w:t xml:space="preserve">•  </w:t>
@@ -1676,7 +2162,8 @@
     </w:p>
     <w:p>
       <w:pPr>
-        <w:ind w:left="360" w:hanging="180"/>
+        <w:spacing w:after="80"/>
+        <w:ind w:left="360" w:hanging="200"/>
       </w:pPr>
       <w:r>
         <w:t xml:space="preserve">•  </w:t>
@@ -1693,22 +2180,33 @@
       </w:r>
     </w:p>
     <w:p>
+      <w:pPr>
+        <w:spacing w:after="80"/>
+      </w:pPr>
       <w:r>
         <w:rPr/>
         <w:t xml:space="preserve">*(Full detail: reports/website-app-building-stack.md.)*</w:t>
       </w:r>
     </w:p>
     <w:p>
-      <w:r>
-        <w:rPr>
-          <w:b/>
+      <w:pPr>
+        <w:spacing w:before="220" w:after="80"/>
+        <w:keepNext/>
+      </w:pPr>
+      <w:r>
+        <w:rPr>
           <w:sz w:val="30"/>
           <w:szCs w:val="30"/>
+          <w:b/>
+          <w:color w:val="1F3864"/>
         </w:rPr>
         <w:t xml:space="preserve">6. Creative — image / video / identity</w:t>
       </w:r>
     </w:p>
     <w:p>
+      <w:pPr>
+        <w:spacing w:after="80"/>
+      </w:pPr>
       <w:r>
         <w:rPr>
           <w:b/>
@@ -1722,7 +2220,8 @@
     </w:p>
     <w:p>
       <w:pPr>
-        <w:ind w:left="360" w:hanging="180"/>
+        <w:spacing w:after="80"/>
+        <w:ind w:left="360" w:hanging="200"/>
       </w:pPr>
       <w:r>
         <w:t xml:space="preserve">•  </w:t>
@@ -1740,7 +2239,8 @@
     </w:p>
     <w:p>
       <w:pPr>
-        <w:ind w:left="360" w:hanging="180"/>
+        <w:spacing w:after="80"/>
+        <w:ind w:left="360" w:hanging="200"/>
       </w:pPr>
       <w:r>
         <w:t xml:space="preserve">•  </w:t>
@@ -1758,7 +2258,8 @@
     </w:p>
     <w:p>
       <w:pPr>
-        <w:ind w:left="360" w:hanging="180"/>
+        <w:spacing w:after="80"/>
+        <w:ind w:left="360" w:hanging="200"/>
       </w:pPr>
       <w:r>
         <w:t xml:space="preserve">•  </w:t>
@@ -1785,6 +2286,9 @@
       </w:r>
     </w:p>
     <w:p>
+      <w:pPr>
+        <w:spacing w:after="80"/>
+      </w:pPr>
       <w:r>
         <w:rPr>
           <w:b/>
@@ -1794,7 +2298,8 @@
     </w:p>
     <w:p>
       <w:pPr>
-        <w:ind w:left="360" w:hanging="180"/>
+        <w:spacing w:after="80"/>
+        <w:ind w:left="360" w:hanging="200"/>
       </w:pPr>
       <w:r>
         <w:t xml:space="preserve">•  </w:t>
@@ -1812,7 +2317,8 @@
     </w:p>
     <w:p>
       <w:pPr>
-        <w:ind w:left="360" w:hanging="180"/>
+        <w:spacing w:after="80"/>
+        <w:ind w:left="360" w:hanging="200"/>
       </w:pPr>
       <w:r>
         <w:t xml:space="preserve">•  </w:t>
@@ -1844,7 +2350,8 @@
     </w:p>
     <w:p>
       <w:pPr>
-        <w:ind w:left="360" w:hanging="180"/>
+        <w:spacing w:after="80"/>
+        <w:ind w:left="360" w:hanging="200"/>
       </w:pPr>
       <w:r>
         <w:t xml:space="preserve">•  </w:t>
@@ -1861,22 +2368,33 @@
       </w:r>
     </w:p>
     <w:p>
+      <w:pPr>
+        <w:spacing w:after="80"/>
+      </w:pPr>
       <w:r>
         <w:rPr/>
         <w:t xml:space="preserve">*(Full detail: reports/creative-identity-tools.md.)*</w:t>
       </w:r>
     </w:p>
     <w:p>
-      <w:r>
-        <w:rPr>
-          <w:b/>
+      <w:pPr>
+        <w:spacing w:before="220" w:after="80"/>
+        <w:keepNext/>
+      </w:pPr>
+      <w:r>
+        <w:rPr>
           <w:sz w:val="30"/>
           <w:szCs w:val="30"/>
+          <w:b/>
+          <w:color w:val="1F3864"/>
         </w:rPr>
         <w:t xml:space="preserve">7. Plugins that require accounts / API keys</w:t>
       </w:r>
     </w:p>
     <w:p>
+      <w:pPr>
+        <w:spacing w:after="80"/>
+      </w:pPr>
       <w:r>
         <w:rPr/>
         <w:t xml:space="preserve">Adding these to the marketplace is free and safe; you only authenticate when you install + use them. </w:t>
@@ -1892,29 +2410,33 @@
       <w:tblPr>
         <w:tblW w:w="0" w:type="auto"/>
         <w:tblBorders>
-          <w:top w:val="single" w:sz="4" w:space="0" w:color="999999"/>
-          <w:left w:val="single" w:sz="4" w:space="0" w:color="999999"/>
-          <w:bottom w:val="single" w:sz="4" w:space="0" w:color="999999"/>
-          <w:right w:val="single" w:sz="4" w:space="0" w:color="999999"/>
-          <w:insideH w:val="single" w:sz="4" w:space="0" w:color="999999"/>
-          <w:insideV w:val="single" w:sz="4" w:space="0" w:color="999999"/>
+          <w:top w:val="single" w:sz="4" w:space="0" w:color="BFBFBF"/>
+          <w:left w:val="single" w:sz="4" w:space="0" w:color="BFBFBF"/>
+          <w:bottom w:val="single" w:sz="4" w:space="0" w:color="BFBFBF"/>
+          <w:right w:val="single" w:sz="4" w:space="0" w:color="BFBFBF"/>
+          <w:insideH w:val="single" w:sz="4" w:space="0" w:color="BFBFBF"/>
+          <w:insideV w:val="single" w:sz="4" w:space="0" w:color="BFBFBF"/>
         </w:tblBorders>
       </w:tblPr>
       <w:tblGrid>
-        <w:gridCol w:w="3000"/>
-        <w:gridCol w:w="3000"/>
-        <w:gridCol w:w="3000"/>
+        <w:gridCol w:w="3120"/>
+        <w:gridCol w:w="3120"/>
+        <w:gridCol w:w="3120"/>
       </w:tblGrid>
       <w:tr>
         <w:tc>
           <w:tcPr>
-            <w:tcW w:w="3000" w:type="dxa"/>
-            <w:shd w:val="clear" w:fill="EFEFEF"/>
-          </w:tcPr>
-          <w:p>
+            <w:tcW w:w="3120" w:type="dxa"/>
+            <w:shd w:val="clear" w:color="auto" w:fill="1F3864"/>
+          </w:tcPr>
+          <w:p>
+            <w:pPr>
+              <w:spacing w:after="20"/>
+            </w:pPr>
             <w:r>
               <w:rPr>
                 <w:b/>
+                <w:color w:val="FFFFFF"/>
               </w:rPr>
               <w:t xml:space="preserve">Plugin(s)</w:t>
             </w:r>
@@ -1922,13 +2444,17 @@
         </w:tc>
         <w:tc>
           <w:tcPr>
-            <w:tcW w:w="3000" w:type="dxa"/>
-            <w:shd w:val="clear" w:fill="EFEFEF"/>
-          </w:tcPr>
-          <w:p>
+            <w:tcW w:w="3120" w:type="dxa"/>
+            <w:shd w:val="clear" w:color="auto" w:fill="1F3864"/>
+          </w:tcPr>
+          <w:p>
+            <w:pPr>
+              <w:spacing w:after="20"/>
+            </w:pPr>
             <w:r>
               <w:rPr>
                 <w:b/>
+                <w:color w:val="FFFFFF"/>
               </w:rPr>
               <w:t xml:space="preserve">Service / account</w:t>
             </w:r>
@@ -1936,13 +2462,17 @@
         </w:tc>
         <w:tc>
           <w:tcPr>
-            <w:tcW w:w="3000" w:type="dxa"/>
-            <w:shd w:val="clear" w:fill="EFEFEF"/>
-          </w:tcPr>
-          <w:p>
+            <w:tcW w:w="3120" w:type="dxa"/>
+            <w:shd w:val="clear" w:color="auto" w:fill="1F3864"/>
+          </w:tcPr>
+          <w:p>
+            <w:pPr>
+              <w:spacing w:after="20"/>
+            </w:pPr>
             <w:r>
               <w:rPr>
                 <w:b/>
+                <w:color w:val="FFFFFF"/>
               </w:rPr>
               <w:t xml:space="preserve">Install now or wait?</w:t>
             </w:r>
@@ -1952,9 +2482,12 @@
       <w:tr>
         <w:tc>
           <w:tcPr>
-            <w:tcW w:w="3000" w:type="dxa"/>
-          </w:tcPr>
-          <w:p>
+            <w:tcW w:w="3120" w:type="dxa"/>
+          </w:tcPr>
+          <w:p>
+            <w:pPr>
+              <w:spacing w:after="20"/>
+            </w:pPr>
             <w:r>
               <w:rPr/>
               <w:t xml:space="preserve">firecrawl</w:t>
@@ -1963,9 +2496,12 @@
         </w:tc>
         <w:tc>
           <w:tcPr>
-            <w:tcW w:w="3000" w:type="dxa"/>
-          </w:tcPr>
-          <w:p>
+            <w:tcW w:w="3120" w:type="dxa"/>
+          </w:tcPr>
+          <w:p>
+            <w:pPr>
+              <w:spacing w:after="20"/>
+            </w:pPr>
             <w:r>
               <w:rPr/>
               <w:t xml:space="preserve">firecrawl.dev (free tier, no card)</w:t>
@@ -1974,9 +2510,12 @@
         </w:tc>
         <w:tc>
           <w:tcPr>
-            <w:tcW w:w="3000" w:type="dxa"/>
-          </w:tcPr>
-          <w:p>
+            <w:tcW w:w="3120" w:type="dxa"/>
+          </w:tcPr>
+          <w:p>
+            <w:pPr>
+              <w:spacing w:after="20"/>
+            </w:pPr>
             <w:r>
               <w:rPr/>
               <w:t xml:space="preserve">OK now (free tier)</w:t>
@@ -1987,9 +2526,12 @@
       <w:tr>
         <w:tc>
           <w:tcPr>
-            <w:tcW w:w="3000" w:type="dxa"/>
-          </w:tcPr>
-          <w:p>
+            <w:tcW w:w="3120" w:type="dxa"/>
+          </w:tcPr>
+          <w:p>
+            <w:pPr>
+              <w:spacing w:after="20"/>
+            </w:pPr>
             <w:r>
               <w:rPr/>
               <w:t xml:space="preserve">langfuse, clerk, sanity, mongodb, checkly</w:t>
@@ -1998,9 +2540,12 @@
         </w:tc>
         <w:tc>
           <w:tcPr>
-            <w:tcW w:w="3000" w:type="dxa"/>
-          </w:tcPr>
-          <w:p>
+            <w:tcW w:w="3120" w:type="dxa"/>
+          </w:tcPr>
+          <w:p>
+            <w:pPr>
+              <w:spacing w:after="20"/>
+            </w:pPr>
             <w:r>
               <w:rPr/>
               <w:t xml:space="preserve">respective free tiers</w:t>
@@ -2009,9 +2554,12 @@
         </w:tc>
         <w:tc>
           <w:tcPr>
-            <w:tcW w:w="3000" w:type="dxa"/>
-          </w:tcPr>
-          <w:p>
+            <w:tcW w:w="3120" w:type="dxa"/>
+          </w:tcPr>
+          <w:p>
+            <w:pPr>
+              <w:spacing w:after="20"/>
+            </w:pPr>
             <w:r>
               <w:rPr/>
               <w:t xml:space="preserve">OK now (free tier)</w:t>
@@ -2022,9 +2570,12 @@
       <w:tr>
         <w:tc>
           <w:tcPr>
-            <w:tcW w:w="3000" w:type="dxa"/>
-          </w:tcPr>
-          <w:p>
+            <w:tcW w:w="3120" w:type="dxa"/>
+          </w:tcPr>
+          <w:p>
+            <w:pPr>
+              <w:spacing w:after="20"/>
+            </w:pPr>
             <w:r>
               <w:rPr/>
               <w:t xml:space="preserve">codex-seo</w:t>
@@ -2033,9 +2584,12 @@
         </w:tc>
         <w:tc>
           <w:tcPr>
-            <w:tcW w:w="3000" w:type="dxa"/>
-          </w:tcPr>
-          <w:p>
+            <w:tcW w:w="3120" w:type="dxa"/>
+          </w:tcPr>
+          <w:p>
+            <w:pPr>
+              <w:spacing w:after="20"/>
+            </w:pPr>
             <w:r>
               <w:rPr/>
               <w:t xml:space="preserve">DataForSEO + Firecrawl + Google AI (paid)</w:t>
@@ -2044,9 +2598,12 @@
         </w:tc>
         <w:tc>
           <w:tcPr>
-            <w:tcW w:w="3000" w:type="dxa"/>
-          </w:tcPr>
-          <w:p>
+            <w:tcW w:w="3120" w:type="dxa"/>
+          </w:tcPr>
+          <w:p>
+            <w:pPr>
+              <w:spacing w:after="20"/>
+            </w:pPr>
             <w:r>
               <w:rPr/>
               <w:t xml:space="preserve">Wait</w:t>
@@ -2057,9 +2614,12 @@
       <w:tr>
         <w:tc>
           <w:tcPr>
-            <w:tcW w:w="3000" w:type="dxa"/>
-          </w:tcPr>
-          <w:p>
+            <w:tcW w:w="3120" w:type="dxa"/>
+          </w:tcPr>
+          <w:p>
+            <w:pPr>
+              <w:spacing w:after="20"/>
+            </w:pPr>
             <w:r>
               <w:rPr/>
               <w:t xml:space="preserve">stripe-link, dodopayments</w:t>
@@ -2068,9 +2628,12 @@
         </w:tc>
         <w:tc>
           <w:tcPr>
-            <w:tcW w:w="3000" w:type="dxa"/>
-          </w:tcPr>
-          <w:p>
+            <w:tcW w:w="3120" w:type="dxa"/>
+          </w:tcPr>
+          <w:p>
+            <w:pPr>
+              <w:spacing w:after="20"/>
+            </w:pPr>
             <w:r>
               <w:rPr/>
               <w:t xml:space="preserve">Stripe / Dodo accounts</w:t>
@@ -2079,9 +2642,12 @@
         </w:tc>
         <w:tc>
           <w:tcPr>
-            <w:tcW w:w="3000" w:type="dxa"/>
-          </w:tcPr>
-          <w:p>
+            <w:tcW w:w="3120" w:type="dxa"/>
+          </w:tcPr>
+          <w:p>
+            <w:pPr>
+              <w:spacing w:after="20"/>
+            </w:pPr>
             <w:r>
               <w:rPr/>
               <w:t xml:space="preserve">Wait</w:t>
@@ -2092,9 +2658,12 @@
       <w:tr>
         <w:tc>
           <w:tcPr>
-            <w:tcW w:w="3000" w:type="dxa"/>
-          </w:tcPr>
-          <w:p>
+            <w:tcW w:w="3120" w:type="dxa"/>
+          </w:tcPr>
+          <w:p>
+            <w:pPr>
+              <w:spacing w:after="20"/>
+            </w:pPr>
             <w:r>
               <w:rPr/>
               <w:t xml:space="preserve">twilio-dev-kit, sendgrid</w:t>
@@ -2103,9 +2672,12 @@
         </w:tc>
         <w:tc>
           <w:tcPr>
-            <w:tcW w:w="3000" w:type="dxa"/>
-          </w:tcPr>
-          <w:p>
+            <w:tcW w:w="3120" w:type="dxa"/>
+          </w:tcPr>
+          <w:p>
+            <w:pPr>
+              <w:spacing w:after="20"/>
+            </w:pPr>
             <w:r>
               <w:rPr/>
               <w:t xml:space="preserve">Twilio account</w:t>
@@ -2114,9 +2686,12 @@
         </w:tc>
         <w:tc>
           <w:tcPr>
-            <w:tcW w:w="3000" w:type="dxa"/>
-          </w:tcPr>
-          <w:p>
+            <w:tcW w:w="3120" w:type="dxa"/>
+          </w:tcPr>
+          <w:p>
+            <w:pPr>
+              <w:spacing w:after="20"/>
+            </w:pPr>
             <w:r>
               <w:rPr/>
               <w:t xml:space="preserve">Wait</w:t>
@@ -2127,9 +2702,12 @@
       <w:tr>
         <w:tc>
           <w:tcPr>
-            <w:tcW w:w="3000" w:type="dxa"/>
-          </w:tcPr>
-          <w:p>
+            <w:tcW w:w="3120" w:type="dxa"/>
+          </w:tcPr>
+          <w:p>
+            <w:pPr>
+              <w:spacing w:after="20"/>
+            </w:pPr>
             <w:r>
               <w:rPr/>
               <w:t xml:space="preserve">nyldn-img, pika, higgsfield, aether, image-studio, video-vision, roboflow, vidseeds</w:t>
@@ -2138,9 +2716,12 @@
         </w:tc>
         <w:tc>
           <w:tcPr>
-            <w:tcW w:w="3000" w:type="dxa"/>
-          </w:tcPr>
-          <w:p>
+            <w:tcW w:w="3120" w:type="dxa"/>
+          </w:tcPr>
+          <w:p>
+            <w:pPr>
+              <w:spacing w:after="20"/>
+            </w:pPr>
             <w:r>
               <w:rPr/>
               <w:t xml:space="preserve">image/video provider accounts/keys</w:t>
@@ -2149,9 +2730,12 @@
         </w:tc>
         <w:tc>
           <w:tcPr>
-            <w:tcW w:w="3000" w:type="dxa"/>
-          </w:tcPr>
-          <w:p>
+            <w:tcW w:w="3120" w:type="dxa"/>
+          </w:tcPr>
+          <w:p>
+            <w:pPr>
+              <w:spacing w:after="20"/>
+            </w:pPr>
             <w:r>
               <w:rPr/>
               <w:t xml:space="preserve">Wait</w:t>
@@ -2162,9 +2746,12 @@
       <w:tr>
         <w:tc>
           <w:tcPr>
-            <w:tcW w:w="3000" w:type="dxa"/>
-          </w:tcPr>
-          <w:p>
+            <w:tcW w:w="3120" w:type="dxa"/>
+          </w:tcPr>
+          <w:p>
+            <w:pPr>
+              <w:spacing w:after="20"/>
+            </w:pPr>
             <w:r>
               <w:rPr/>
               <w:t xml:space="preserve">datocms, accelerate-wp, spotify-ads, seam, drpc, alation, truefoundry, azure-documentdb</w:t>
@@ -2173,9 +2760,12 @@
         </w:tc>
         <w:tc>
           <w:tcPr>
-            <w:tcW w:w="3000" w:type="dxa"/>
-          </w:tcPr>
-          <w:p>
+            <w:tcW w:w="3120" w:type="dxa"/>
+          </w:tcPr>
+          <w:p>
+            <w:pPr>
+              <w:spacing w:after="20"/>
+            </w:pPr>
             <w:r>
               <w:rPr/>
               <w:t xml:space="preserve">vendor accounts</w:t>
@@ -2184,9 +2774,12 @@
         </w:tc>
         <w:tc>
           <w:tcPr>
-            <w:tcW w:w="3000" w:type="dxa"/>
-          </w:tcPr>
-          <w:p>
+            <w:tcW w:w="3120" w:type="dxa"/>
+          </w:tcPr>
+          <w:p>
+            <w:pPr>
+              <w:spacing w:after="20"/>
+            </w:pPr>
             <w:r>
               <w:rPr/>
               <w:t xml:space="preserve">Wait</w:t>
@@ -2197,9 +2790,12 @@
       <w:tr>
         <w:tc>
           <w:tcPr>
-            <w:tcW w:w="3000" w:type="dxa"/>
-          </w:tcPr>
-          <w:p>
+            <w:tcW w:w="3120" w:type="dxa"/>
+          </w:tcPr>
+          <w:p>
+            <w:pPr>
+              <w:spacing w:after="20"/>
+            </w:pPr>
             <w:r>
               <w:rPr/>
               <w:t xml:space="preserve">bitbucket-cli, jenkins-cli, atlassian-forge</w:t>
@@ -2208,9 +2804,12 @@
         </w:tc>
         <w:tc>
           <w:tcPr>
-            <w:tcW w:w="3000" w:type="dxa"/>
-          </w:tcPr>
-          <w:p>
+            <w:tcW w:w="3120" w:type="dxa"/>
+          </w:tcPr>
+          <w:p>
+            <w:pPr>
+              <w:spacing w:after="20"/>
+            </w:pPr>
             <w:r>
               <w:rPr/>
               <w:t xml:space="preserve">Atlassian/Jenkins creds</w:t>
@@ -2219,9 +2818,12 @@
         </w:tc>
         <w:tc>
           <w:tcPr>
-            <w:tcW w:w="3000" w:type="dxa"/>
-          </w:tcPr>
-          <w:p>
+            <w:tcW w:w="3120" w:type="dxa"/>
+          </w:tcPr>
+          <w:p>
+            <w:pPr>
+              <w:spacing w:after="20"/>
+            </w:pPr>
             <w:r>
               <w:rPr/>
               <w:t xml:space="preserve">Wait</w:t>
@@ -2232,9 +2834,12 @@
       <w:tr>
         <w:tc>
           <w:tcPr>
-            <w:tcW w:w="3000" w:type="dxa"/>
-          </w:tcPr>
-          <w:p>
+            <w:tcW w:w="3120" w:type="dxa"/>
+          </w:tcPr>
+          <w:p>
+            <w:pPr>
+              <w:spacing w:after="20"/>
+            </w:pPr>
             <w:r>
               <w:rPr/>
               <w:t xml:space="preserve">gpt-researcher, llm-router</w:t>
@@ -2243,9 +2848,12 @@
         </w:tc>
         <w:tc>
           <w:tcPr>
-            <w:tcW w:w="3000" w:type="dxa"/>
-          </w:tcPr>
-          <w:p>
+            <w:tcW w:w="3120" w:type="dxa"/>
+          </w:tcPr>
+          <w:p>
+            <w:pPr>
+              <w:spacing w:after="20"/>
+            </w:pPr>
             <w:r>
               <w:rPr/>
               <w:t xml:space="preserve">an LLM API key (you likely have)</w:t>
@@ -2254,9 +2862,12 @@
         </w:tc>
         <w:tc>
           <w:tcPr>
-            <w:tcW w:w="3000" w:type="dxa"/>
-          </w:tcPr>
-          <w:p>
+            <w:tcW w:w="3120" w:type="dxa"/>
+          </w:tcPr>
+          <w:p>
+            <w:pPr>
+              <w:spacing w:after="20"/>
+            </w:pPr>
             <w:r>
               <w:rPr/>
               <w:t xml:space="preserve">When needed</w:t>
@@ -2267,9 +2878,12 @@
       <w:tr>
         <w:tc>
           <w:tcPr>
-            <w:tcW w:w="3000" w:type="dxa"/>
-          </w:tcPr>
-          <w:p>
+            <w:tcW w:w="3120" w:type="dxa"/>
+          </w:tcPr>
+          <w:p>
+            <w:pPr>
+              <w:spacing w:after="20"/>
+            </w:pPr>
             <w:r>
               <w:rPr/>
               <w:t xml:space="preserve">metabase, dataproduct-builder-dbt, n8n-codex</w:t>
@@ -2278,9 +2892,12 @@
         </w:tc>
         <w:tc>
           <w:tcPr>
-            <w:tcW w:w="3000" w:type="dxa"/>
-          </w:tcPr>
-          <w:p>
+            <w:tcW w:w="3120" w:type="dxa"/>
+          </w:tcPr>
+          <w:p>
+            <w:pPr>
+              <w:spacing w:after="20"/>
+            </w:pPr>
             <w:r>
               <w:rPr/>
               <w:t xml:space="preserve">self-hosted instance/warehouse</w:t>
@@ -2289,9 +2906,12 @@
         </w:tc>
         <w:tc>
           <w:tcPr>
-            <w:tcW w:w="3000" w:type="dxa"/>
-          </w:tcPr>
-          <w:p>
+            <w:tcW w:w="3120" w:type="dxa"/>
+          </w:tcPr>
+          <w:p>
+            <w:pPr>
+              <w:spacing w:after="20"/>
+            </w:pPr>
             <w:r>
               <w:rPr/>
               <w:t xml:space="preserve">Wait</w:t>
@@ -2302,9 +2922,12 @@
       <w:tr>
         <w:tc>
           <w:tcPr>
-            <w:tcW w:w="3000" w:type="dxa"/>
-          </w:tcPr>
-          <w:p>
+            <w:tcW w:w="3120" w:type="dxa"/>
+          </w:tcPr>
+          <w:p>
+            <w:pPr>
+              <w:spacing w:after="20"/>
+            </w:pPr>
             <w:r>
               <w:rPr/>
               <w:t xml:space="preserve">OpenAI-fork connectors (Gmail, Slack, Notion, Stripe, Supabase, Vercel, Semrush, FactSet, Factiva, Morningstar, …)</w:t>
@@ -2313,9 +2936,12 @@
         </w:tc>
         <w:tc>
           <w:tcPr>
-            <w:tcW w:w="3000" w:type="dxa"/>
-          </w:tcPr>
-          <w:p>
+            <w:tcW w:w="3120" w:type="dxa"/>
+          </w:tcPr>
+          <w:p>
+            <w:pPr>
+              <w:spacing w:after="20"/>
+            </w:pPr>
             <w:r>
               <w:rPr/>
               <w:t xml:space="preserve">each service's OAuth</w:t>
@@ -2324,9 +2950,12 @@
         </w:tc>
         <w:tc>
           <w:tcPr>
-            <w:tcW w:w="3000" w:type="dxa"/>
-          </w:tcPr>
-          <w:p>
+            <w:tcW w:w="3120" w:type="dxa"/>
+          </w:tcPr>
+          <w:p>
+            <w:pPr>
+              <w:spacing w:after="20"/>
+            </w:pPr>
             <w:r>
               <w:rPr/>
               <w:t xml:space="preserve">Per service, when used</w:t>
@@ -2336,22 +2965,33 @@
       </w:tr>
     </w:tbl>
     <w:p>
+      <w:pPr>
+        <w:spacing w:after="80"/>
+      </w:pPr>
       <w:r>
         <w:rPr/>
         <w:t xml:space="preserve">*(Full table: reports/api-and-account-requirements.md.)*</w:t>
       </w:r>
     </w:p>
     <w:p>
-      <w:r>
-        <w:rPr>
-          <w:b/>
+      <w:pPr>
+        <w:spacing w:before="220" w:after="80"/>
+        <w:keepNext/>
+      </w:pPr>
+      <w:r>
+        <w:rPr>
           <w:sz w:val="30"/>
           <w:szCs w:val="30"/>
+          <w:b/>
+          <w:color w:val="1F3864"/>
         </w:rPr>
         <w:t xml:space="preserve">8. Do-not-install-yet list</w:t>
       </w:r>
     </w:p>
     <w:p>
+      <w:pPr>
+        <w:spacing w:after="80"/>
+      </w:pPr>
       <w:r>
         <w:rPr/>
         <w:t xml:space="preserve">Powerful or situational — wait until you're ready:</w:t>
@@ -2359,7 +2999,8 @@
     </w:p>
     <w:p>
       <w:pPr>
-        <w:ind w:left="360" w:hanging="180"/>
+        <w:spacing w:after="80"/>
+        <w:ind w:left="360" w:hanging="200"/>
       </w:pPr>
       <w:r>
         <w:t xml:space="preserve">•  </w:t>
@@ -2377,7 +3018,8 @@
     </w:p>
     <w:p>
       <w:pPr>
-        <w:ind w:left="360" w:hanging="180"/>
+        <w:spacing w:after="80"/>
+        <w:ind w:left="360" w:hanging="200"/>
       </w:pPr>
       <w:r>
         <w:t xml:space="preserve">•  </w:t>
@@ -2395,7 +3037,8 @@
     </w:p>
     <w:p>
       <w:pPr>
-        <w:ind w:left="360" w:hanging="180"/>
+        <w:spacing w:after="80"/>
+        <w:ind w:left="360" w:hanging="200"/>
       </w:pPr>
       <w:r>
         <w:t xml:space="preserve">•  </w:t>
@@ -2413,7 +3056,8 @@
     </w:p>
     <w:p>
       <w:pPr>
-        <w:ind w:left="360" w:hanging="180"/>
+        <w:spacing w:after="80"/>
+        <w:ind w:left="360" w:hanging="200"/>
       </w:pPr>
       <w:r>
         <w:t xml:space="preserve">•  </w:t>
@@ -2431,7 +3075,8 @@
     </w:p>
     <w:p>
       <w:pPr>
-        <w:ind w:left="360" w:hanging="180"/>
+        <w:spacing w:after="80"/>
+        <w:ind w:left="360" w:hanging="200"/>
       </w:pPr>
       <w:r>
         <w:t xml:space="preserve">•  </w:t>
@@ -2448,16 +3093,24 @@
       </w:r>
     </w:p>
     <w:p>
-      <w:r>
-        <w:rPr>
-          <w:b/>
+      <w:pPr>
+        <w:spacing w:before="220" w:after="80"/>
+        <w:keepNext/>
+      </w:pPr>
+      <w:r>
+        <w:rPr>
           <w:sz w:val="30"/>
           <w:szCs w:val="30"/>
+          <w:b/>
+          <w:color w:val="1F3864"/>
         </w:rPr>
         <w:t xml:space="preserve">9. Full plugin dashboard</w:t>
       </w:r>
     </w:p>
     <w:p>
+      <w:pPr>
+        <w:spacing w:after="80"/>
+      </w:pPr>
       <w:r>
         <w:rPr/>
         <w:t xml:space="preserve">The complete, sortable list of all 257 plugins (category, source wave, install priority, account need, platform, risk) lives in:</w:t>
@@ -2465,7 +3118,8 @@
     </w:p>
     <w:p>
       <w:pPr>
-        <w:ind w:left="360" w:hanging="180"/>
+        <w:spacing w:after="80"/>
+        <w:ind w:left="360" w:hanging="200"/>
       </w:pPr>
       <w:r>
         <w:t xml:space="preserve">•  </w:t>
@@ -2483,7 +3137,8 @@
     </w:p>
     <w:p>
       <w:pPr>
-        <w:ind w:left="360" w:hanging="180"/>
+        <w:spacing w:after="80"/>
+        <w:ind w:left="360" w:hanging="200"/>
       </w:pPr>
       <w:r>
         <w:t xml:space="preserve">•  </w:t>
@@ -2500,6 +3155,9 @@
       </w:r>
     </w:p>
     <w:p>
+      <w:pPr>
+        <w:spacing w:after="80"/>
+      </w:pPr>
       <w:r>
         <w:rPr>
           <w:b/>
@@ -2512,6 +3170,9 @@
       </w:r>
     </w:p>
     <w:p>
+      <w:pPr>
+        <w:spacing w:after="80"/>
+      </w:pPr>
       <w:r>
         <w:rPr>
           <w:b/>
@@ -2524,6 +3185,9 @@
       </w:r>
     </w:p>
     <w:p>
+      <w:pPr>
+        <w:spacing w:after="80"/>
+      </w:pPr>
       <w:r>
         <w:rPr>
           <w:b/>
@@ -2537,7 +3201,7 @@
     </w:p>
     <w:sectPr>
       <w:pgSz w:w="12240" w:h="15840"/>
-      <w:pgMar w:top="1440" w:right="1440" w:bottom="1440" w:left="1440" w:header="720" w:footer="720" w:gutter="0"/>
+      <w:pgMar w:top="1440" w:right="1440" w:bottom="1440" w:left="1440"/>
     </w:sectPr>
   </w:body>
 </w:document>

</xml_diff>